<commit_message>
Cite the Zenodo version DOI in reference 11
doi:10.5281/zenodo.22875737 (version), not 10.5281/zenodo.22875736 (concept),
so the archive a reviewer opens cannot change after review. Added to
CITATION.cff as well. Availability statement now points at Zenodo rather than
the repository.

Co-Authored-By: Claude Opus 5 <noreply@anthropic.com>
</commit_message>
<xml_diff>
--- a/publication/MANUSCRIPT.docx
+++ b/publication/MANUSCRIPT.docx
@@ -575,7 +575,7 @@
         <w:t>Availability of data and materials.</w:t>
       </w:r>
       <w:r>
-        <w:t xml:space="preserve"> Variant frequencies are from gnomAD v4 [8, 9] and peak calls from the ENCODE portal [10]. All analysis code, the frozen allele ledger, per-variant predictions, contingency counts for every endpoint, the ENCODE peak manifest, the track manifest, partition labels, the ranking provenance record, the six change-in-contrast estimates with intervals, and the bootstrap stability table are available in the apol1-alphagenome repository [11]. Model predictions were obtained under AlphaGenome's non-commercial research terms and are redistributed subject to them; model weights were not accessed.</w:t>
+        <w:t xml:space="preserve"> Variant frequencies are from gnomAD v4 [8, 9] and peak calls from the ENCODE portal [10]. All analysis code, the frozen allele ledger, per-variant predictions, contingency counts for every endpoint, the ENCODE peak manifest, the track manifest, partition labels, the ranking provenance record, the six change-in-contrast estimates with intervals, and the bootstrap stability table are archived at Zenodo [11]. Model predictions were obtained under AlphaGenome's non-commercial research terms and are redistributed subject to them; model weights were not accessed.</w:t>
       </w:r>
     </w:p>
     <w:p>
@@ -737,7 +737,7 @@
         <w:pStyle w:val="ListNumber"/>
       </w:pPr>
       <w:r>
-        <w:t>Lawrence C. apol1-alphagenome: analysis code and frozen results, release v1.0-bmcrn. https://github.com/PatientThread/apol1-alphagenome/releases/tag/v1.0-bmcrn (accessed 21 September 2026).</w:t>
+        <w:t>Lawrence C. apol1-alphagenome: analysis code and frozen results, version v1.0-bmcrn. Zenodo; 2026. doi:10.5281/zenodo.22875737. Also at https://github.com/PatientThread/apol1-alphagenome</w:t>
       </w:r>
     </w:p>
     <w:p>

</xml_diff>

<commit_message>
Cover letter, full affiliation, and the AI declaration BMC requires
Address added: 9 Harley Street, London W1G 6AL. Flagged by reviewers three
times as an incomplete affiliation.

AI DECLARATION was missing from this manuscript. The Transplant International
letter carries one; this did not. Springer Nature requires generative AI use to
be declared in the Introduction or Acknowledgements, with the cover-letter-only
route reserved for AI-assisted copy editing. Use here went well beyond copy
editing, so it is declared in the Acknowledgements and restated in the cover
letter. Declarations sit outside the word limit, so the body is unchanged at
1,992.

Co-Authored-By: Claude Opus 5 <noreply@anthropic.com>
</commit_message>
<xml_diff>
--- a/publication/MANUSCRIPT.docx
+++ b/publication/MANUSCRIPT.docx
@@ -19,7 +19,7 @@
         <w:t>Christopher Lawrence</w:t>
       </w:r>
       <w:r>
-        <w:t xml:space="preserve"> Consultant Nephrologist, London, United Kingdom ORCID 0000-0002-8159-0879 Correspondence: Christopher.lawrence3@nhs.net</w:t>
+        <w:t xml:space="preserve"> Consultant Nephrologist 9 Harley Street, London W1G 6AL, United Kingdom ORCID 0000-0002-8159-0879 Correspondence: Christopher.lawrence3@nhs.net</w:t>
       </w:r>
     </w:p>
     <w:p>
@@ -623,7 +623,7 @@
         <w:t>Acknowledgements.</w:t>
       </w:r>
       <w:r>
-        <w:t xml:space="preserve"> Not applicable.</w:t>
+        <w:t xml:space="preserve"> During the preparation of this work the author used Claude (Opus 5, Anthropic) to search and verify the published literature, to check quoted figures and citations against primary sources, and to draft and revise the text and analysis code. After using this tool the author reviewed and edited the content as needed and takes full responsibility for the content of the publication. The tool is not listed as an author.</w:t>
       </w:r>
     </w:p>
     <w:p>

</xml_diff>